<commit_message>
Update MIDWIFE system before final defense
</commit_message>
<xml_diff>
--- a/assets/templates/prc-forms-template.docx
+++ b/assets/templates/prc-forms-template.docx
@@ -15,6 +15,8 @@
     <w:p>
       <w:pPr>
         <w:pStyle w:val="Default"/>
+        <w:keepNext w:val="1"/>
+        <w:keepLines w:val="1"/>
       </w:pPr>
       <w:r>
         <w:rPr>
@@ -78,6 +80,8 @@
     <w:p>
       <w:pPr>
         <w:pStyle w:val="Default"/>
+        <w:keepNext w:val="1"/>
+        <w:keepLines w:val="1"/>
         <w:ind w:left="1440" w:firstLine="720"/>
         <w:rPr>
           <w:sz w:val="23"/>
@@ -102,6 +106,8 @@
     <w:p>
       <w:pPr>
         <w:pStyle w:val="Default"/>
+        <w:keepNext w:val="1"/>
+        <w:keepLines w:val="1"/>
         <w:rPr>
           <w:sz w:val="23"/>
           <w:szCs w:val="23"/>
@@ -197,6 +203,8 @@
     <w:p>
       <w:pPr>
         <w:pStyle w:val="Default"/>
+        <w:keepNext w:val="1"/>
+        <w:keepLines w:val="1"/>
         <w:rPr>
           <w:sz w:val="23"/>
           <w:szCs w:val="23"/>
@@ -287,6 +295,8 @@
     <w:p>
       <w:pPr>
         <w:pStyle w:val="Default"/>
+        <w:keepNext w:val="1"/>
+        <w:keepLines w:val="1"/>
         <w:jc w:val="center"/>
         <w:rPr>
           <w:b/>
@@ -352,6 +362,8 @@
     <w:p>
       <w:pPr>
         <w:pStyle w:val="Default"/>
+        <w:keepNext w:val="1"/>
+        <w:keepLines w:val="1"/>
         <w:ind w:left="10080"/>
         <w:rPr>
           <w:sz w:val="23"/>
@@ -372,6 +384,8 @@
     <w:p>
       <w:pPr>
         <w:pStyle w:val="Default"/>
+        <w:keepNext w:val="1"/>
+        <w:keepLines w:val="1"/>
         <w:ind w:left="10080"/>
         <w:rPr>
           <w:sz w:val="23"/>
@@ -540,6 +554,8 @@
     <w:p>
       <w:pPr>
         <w:pStyle w:val="Default"/>
+        <w:keepNext w:val="1"/>
+        <w:keepLines w:val="1"/>
         <w:ind w:left="11520" w:firstLine="720"/>
         <w:rPr>
           <w:sz w:val="23"/>
@@ -557,11 +573,15 @@
     <w:p>
       <w:pPr>
         <w:pStyle w:val="Default"/>
+        <w:keepNext w:val="1"/>
+        <w:keepLines w:val="1"/>
       </w:pPr>
     </w:p>
     <w:p>
       <w:pPr>
         <w:pStyle w:val="Default"/>
+        <w:keepNext w:val="1"/>
+        <w:keepLines w:val="1"/>
         <w:spacing w:after="240"/>
         <w:ind w:firstLine="720"/>
         <w:jc w:val="both"/>
@@ -625,6 +645,7 @@
       <w:tblPr>
         <w:tblStyle w:val="TableGrid"/>
         <w:tblW w:w="0" w:type="auto"/>
+        <w:jc w:val="center"/>
         <w:tblLayout w:type="fixed"/>
         <w:tblLook w:val="04A0" w:firstRow="1" w:lastRow="0" w:firstColumn="1" w:lastColumn="0" w:noHBand="0" w:noVBand="1"/>
       </w:tblPr>
@@ -2491,6 +2512,7 @@
       <w:tblPr>
         <w:tblStyle w:val="TableGrid"/>
         <w:tblW w:w="0" w:type="auto"/>
+        <w:jc w:val="center"/>
         <w:tblLayout w:type="fixed"/>
         <w:tblLook w:val="04A0" w:firstRow="1" w:lastRow="0" w:firstColumn="1" w:lastColumn="0" w:noHBand="0" w:noVBand="1"/>
       </w:tblPr>
@@ -4305,6 +4327,10 @@
     <w:p>
       <w:pPr>
         <w:pStyle w:val="Default"/>
+        <w:keepNext w:val="1"/>
+        <w:keepLines w:val="1"/>
+        <w:snapToGrid w:val="0"/>
+        <w:spacing w:before="0" w:after="0" w:line="240" w:lineRule="auto"/>
         <w:rPr>
           <w:b/>
           <w:bCs/>
@@ -4355,10 +4381,14 @@
     <w:p>
       <w:pPr>
         <w:pStyle w:val="Default"/>
+        <w:keepNext w:val="1"/>
+        <w:keepLines w:val="1"/>
         <w:numPr>
           <w:ilvl w:val="0"/>
           <w:numId w:val="2"/>
         </w:numPr>
+        <w:snapToGrid w:val="0"/>
+        <w:spacing w:before="0" w:after="0" w:line="240" w:lineRule="auto"/>
         <w:rPr>
           <w:b/>
           <w:bCs/>
@@ -4381,6 +4411,10 @@
     <w:p>
       <w:pPr>
         <w:pStyle w:val="Default"/>
+        <w:keepNext w:val="1"/>
+        <w:keepLines w:val="1"/>
+        <w:snapToGrid w:val="0"/>
+        <w:spacing w:before="0" w:after="0" w:line="40" w:lineRule="exact"/>
         <w:rPr>
           <w:b/>
           <w:bCs/>
@@ -4392,6 +4426,10 @@
     <w:p>
       <w:pPr>
         <w:pStyle w:val="Default"/>
+        <w:keepNext w:val="1"/>
+        <w:keepLines w:val="1"/>
+        <w:snapToGrid w:val="0"/>
+        <w:spacing w:before="0" w:after="0" w:line="40" w:lineRule="exact"/>
         <w:rPr>
           <w:b/>
           <w:bCs/>
@@ -4403,6 +4441,10 @@
     <w:p>
       <w:pPr>
         <w:pStyle w:val="Default"/>
+        <w:keepNext w:val="1"/>
+        <w:keepLines w:val="1"/>
+        <w:snapToGrid w:val="0"/>
+        <w:spacing w:before="0" w:after="0" w:line="240" w:lineRule="auto"/>
         <w:ind w:left="1440"/>
         <w:rPr>
           <w:sz w:val="22"/>
@@ -4429,6 +4471,10 @@
     <w:p>
       <w:pPr>
         <w:pStyle w:val="Default"/>
+        <w:keepNext w:val="1"/>
+        <w:keepLines w:val="1"/>
+        <w:snapToGrid w:val="0"/>
+        <w:spacing w:before="0" w:after="0" w:line="240" w:lineRule="auto"/>
         <w:rPr>
           <w:sz w:val="22"/>
           <w:szCs w:val="22"/>
@@ -4454,6 +4500,10 @@
     <w:p>
       <w:pPr>
         <w:pStyle w:val="Default"/>
+        <w:keepNext w:val="1"/>
+        <w:keepLines w:val="1"/>
+        <w:snapToGrid w:val="0"/>
+        <w:spacing w:before="0" w:after="0" w:line="240" w:lineRule="auto"/>
         <w:rPr>
           <w:b/>
           <w:sz w:val="22"/>
@@ -4570,6 +4620,10 @@
     <w:p>
       <w:pPr>
         <w:pStyle w:val="Default"/>
+        <w:keepNext w:val="1"/>
+        <w:keepLines w:val="1"/>
+        <w:snapToGrid w:val="0"/>
+        <w:spacing w:before="0" w:after="0" w:line="40" w:lineRule="exact"/>
         <w:rPr>
           <w:b/>
           <w:sz w:val="22"/>
@@ -4708,6 +4762,10 @@
     <w:p>
       <w:pPr>
         <w:pStyle w:val="Default"/>
+        <w:keepNext w:val="1"/>
+        <w:keepLines w:val="1"/>
+        <w:snapToGrid w:val="0"/>
+        <w:spacing w:before="0" w:after="0" w:line="240" w:lineRule="auto"/>
         <w:rPr>
           <w:sz w:val="20"/>
           <w:szCs w:val="20"/>
@@ -5014,6 +5072,10 @@
     <w:p>
       <w:pPr>
         <w:pStyle w:val="Default"/>
+        <w:keepNext w:val="1"/>
+        <w:keepLines w:val="1"/>
+        <w:snapToGrid w:val="0"/>
+        <w:spacing w:before="0" w:after="0" w:line="240" w:lineRule="auto"/>
         <w:rPr>
           <w:b/>
           <w:bCs/>
@@ -5199,6 +5261,10 @@
     <w:p>
       <w:pPr>
         <w:pStyle w:val="Default"/>
+        <w:keepNext w:val="1"/>
+        <w:keepLines w:val="1"/>
+        <w:snapToGrid w:val="0"/>
+        <w:spacing w:before="0" w:after="0" w:line="240" w:lineRule="auto"/>
         <w:rPr>
           <w:b/>
           <w:bCs/>
@@ -5303,6 +5369,10 @@
     <w:p>
       <w:pPr>
         <w:pStyle w:val="Default"/>
+        <w:keepNext w:val="0"/>
+        <w:keepLines w:val="1"/>
+        <w:snapToGrid w:val="0"/>
+        <w:spacing w:before="0" w:after="0" w:line="240" w:lineRule="auto"/>
         <w:ind w:left="9360" w:firstLine="720"/>
         <w:rPr>
           <w:sz w:val="20"/>
@@ -5414,6 +5484,8 @@
     <w:p>
       <w:pPr>
         <w:pStyle w:val="Default"/>
+        <w:keepNext w:val="1"/>
+        <w:keepLines w:val="1"/>
         <w:ind w:left="9360" w:firstLine="720"/>
         <w:rPr>
           <w:sz w:val="20"/>
@@ -5484,6 +5556,8 @@
     <w:p>
       <w:pPr>
         <w:pStyle w:val="Default"/>
+        <w:keepNext w:val="1"/>
+        <w:keepLines w:val="1"/>
         <w:ind w:left="1440" w:firstLine="720"/>
         <w:rPr>
           <w:sz w:val="23"/>
@@ -5552,6 +5626,8 @@
     <w:p>
       <w:pPr>
         <w:pStyle w:val="Default"/>
+        <w:keepNext w:val="1"/>
+        <w:keepLines w:val="1"/>
         <w:rPr>
           <w:sz w:val="23"/>
           <w:szCs w:val="23"/>
@@ -5647,6 +5723,8 @@
     <w:p>
       <w:pPr>
         <w:pStyle w:val="Default"/>
+        <w:keepNext w:val="1"/>
+        <w:keepLines w:val="1"/>
         <w:rPr>
           <w:sz w:val="23"/>
           <w:szCs w:val="23"/>
@@ -5737,6 +5815,8 @@
     <w:p>
       <w:pPr>
         <w:pStyle w:val="Default"/>
+        <w:keepNext w:val="1"/>
+        <w:keepLines w:val="1"/>
         <w:jc w:val="center"/>
         <w:rPr>
           <w:b/>
@@ -5781,6 +5861,8 @@
     <w:p>
       <w:pPr>
         <w:pStyle w:val="Default"/>
+        <w:keepNext w:val="1"/>
+        <w:keepLines w:val="1"/>
         <w:ind w:left="10080"/>
         <w:rPr>
           <w:sz w:val="23"/>
@@ -5801,6 +5883,8 @@
     <w:p>
       <w:pPr>
         <w:pStyle w:val="Default"/>
+        <w:keepNext w:val="1"/>
+        <w:keepLines w:val="1"/>
         <w:ind w:left="10080"/>
         <w:rPr>
           <w:sz w:val="23"/>
@@ -5969,6 +6053,8 @@
     <w:p>
       <w:pPr>
         <w:pStyle w:val="Default"/>
+        <w:keepNext w:val="1"/>
+        <w:keepLines w:val="1"/>
         <w:ind w:left="11520" w:firstLine="720"/>
         <w:rPr>
           <w:sz w:val="23"/>
@@ -5986,11 +6072,15 @@
     <w:p>
       <w:pPr>
         <w:pStyle w:val="Default"/>
+        <w:keepNext w:val="1"/>
+        <w:keepLines w:val="1"/>
       </w:pPr>
     </w:p>
     <w:p>
       <w:pPr>
         <w:pStyle w:val="Default"/>
+        <w:keepNext w:val="1"/>
+        <w:keepLines w:val="1"/>
         <w:spacing w:after="240"/>
         <w:ind w:firstLine="720"/>
         <w:jc w:val="both"/>
@@ -6046,6 +6136,7 @@
       <w:tblPr>
         <w:tblStyle w:val="TableGrid"/>
         <w:tblW w:w="0" w:type="auto"/>
+        <w:jc w:val="center"/>
         <w:tblLayout w:type="fixed"/>
         <w:tblLook w:val="04A0" w:firstRow="1" w:lastRow="0" w:firstColumn="1" w:lastColumn="0" w:noHBand="0" w:noVBand="1"/>
       </w:tblPr>
@@ -7156,6 +7247,10 @@
     <w:p>
       <w:pPr>
         <w:pStyle w:val="Default"/>
+        <w:keepNext w:val="1"/>
+        <w:keepLines w:val="1"/>
+        <w:snapToGrid w:val="0"/>
+        <w:spacing w:before="0" w:after="0" w:line="240" w:lineRule="auto"/>
         <w:rPr>
           <w:b/>
           <w:bCs/>
@@ -7206,6 +7301,10 @@
     <w:p>
       <w:pPr>
         <w:pStyle w:val="Default"/>
+        <w:keepNext w:val="1"/>
+        <w:keepLines w:val="1"/>
+        <w:snapToGrid w:val="0"/>
+        <w:spacing w:before="0" w:after="0" w:line="240" w:lineRule="auto"/>
         <w:ind w:left="1440"/>
         <w:rPr>
           <w:b/>
@@ -7229,6 +7328,10 @@
     <w:p>
       <w:pPr>
         <w:pStyle w:val="Default"/>
+        <w:keepNext w:val="1"/>
+        <w:keepLines w:val="1"/>
+        <w:snapToGrid w:val="0"/>
+        <w:spacing w:before="0" w:after="0" w:line="40" w:lineRule="exact"/>
         <w:ind w:left="720" w:firstLine="720"/>
         <w:rPr>
           <w:b/>
@@ -7241,6 +7344,10 @@
     <w:p>
       <w:pPr>
         <w:pStyle w:val="Default"/>
+        <w:keepNext w:val="1"/>
+        <w:keepLines w:val="1"/>
+        <w:snapToGrid w:val="0"/>
+        <w:spacing w:before="0" w:after="0" w:line="40" w:lineRule="exact"/>
         <w:ind w:left="720" w:firstLine="720"/>
         <w:rPr>
           <w:b/>
@@ -7253,6 +7360,10 @@
     <w:p>
       <w:pPr>
         <w:pStyle w:val="Default"/>
+        <w:keepNext w:val="1"/>
+        <w:keepLines w:val="1"/>
+        <w:snapToGrid w:val="0"/>
+        <w:spacing w:before="0" w:after="0" w:line="40" w:lineRule="exact"/>
         <w:ind w:left="720" w:firstLine="720"/>
         <w:rPr>
           <w:b/>
@@ -7265,6 +7376,10 @@
     <w:p>
       <w:pPr>
         <w:pStyle w:val="Default"/>
+        <w:keepNext w:val="1"/>
+        <w:keepLines w:val="1"/>
+        <w:snapToGrid w:val="0"/>
+        <w:spacing w:before="0" w:after="0" w:line="240" w:lineRule="auto"/>
         <w:ind w:left="1440"/>
         <w:rPr>
           <w:sz w:val="22"/>
@@ -7291,6 +7406,10 @@
     <w:p>
       <w:pPr>
         <w:pStyle w:val="Default"/>
+        <w:keepNext w:val="1"/>
+        <w:keepLines w:val="1"/>
+        <w:snapToGrid w:val="0"/>
+        <w:spacing w:before="0" w:after="0" w:line="240" w:lineRule="auto"/>
         <w:rPr>
           <w:sz w:val="22"/>
           <w:szCs w:val="22"/>
@@ -7316,6 +7435,10 @@
     <w:p>
       <w:pPr>
         <w:pStyle w:val="Default"/>
+        <w:keepNext w:val="1"/>
+        <w:keepLines w:val="1"/>
+        <w:snapToGrid w:val="0"/>
+        <w:spacing w:before="0" w:after="0" w:line="240" w:lineRule="auto"/>
         <w:rPr>
           <w:b/>
           <w:sz w:val="22"/>
@@ -7432,6 +7555,10 @@
     <w:p>
       <w:pPr>
         <w:pStyle w:val="Default"/>
+        <w:keepNext w:val="1"/>
+        <w:keepLines w:val="1"/>
+        <w:snapToGrid w:val="0"/>
+        <w:spacing w:before="0" w:after="0" w:line="40" w:lineRule="exact"/>
         <w:rPr>
           <w:b/>
           <w:sz w:val="22"/>
@@ -7570,6 +7697,10 @@
     <w:p>
       <w:pPr>
         <w:pStyle w:val="Default"/>
+        <w:keepNext w:val="1"/>
+        <w:keepLines w:val="1"/>
+        <w:snapToGrid w:val="0"/>
+        <w:spacing w:before="0" w:after="0" w:line="240" w:lineRule="auto"/>
         <w:rPr>
           <w:sz w:val="20"/>
           <w:szCs w:val="20"/>
@@ -7876,6 +8007,10 @@
     <w:p>
       <w:pPr>
         <w:pStyle w:val="Default"/>
+        <w:keepNext w:val="1"/>
+        <w:keepLines w:val="1"/>
+        <w:snapToGrid w:val="0"/>
+        <w:spacing w:before="0" w:after="0" w:line="240" w:lineRule="auto"/>
         <w:rPr>
           <w:b/>
           <w:bCs/>
@@ -8061,6 +8196,10 @@
     <w:p>
       <w:pPr>
         <w:pStyle w:val="Default"/>
+        <w:keepNext w:val="1"/>
+        <w:keepLines w:val="1"/>
+        <w:snapToGrid w:val="0"/>
+        <w:spacing w:before="0" w:after="0" w:line="240" w:lineRule="auto"/>
         <w:rPr>
           <w:b/>
           <w:bCs/>
@@ -8169,6 +8308,10 @@
     <w:p>
       <w:pPr>
         <w:pStyle w:val="Default"/>
+        <w:keepNext w:val="0"/>
+        <w:keepLines w:val="1"/>
+        <w:snapToGrid w:val="0"/>
+        <w:spacing w:before="0" w:after="0" w:line="240" w:lineRule="auto"/>
         <w:ind w:left="9360" w:firstLine="720"/>
         <w:rPr>
           <w:sz w:val="20"/>
@@ -8260,6 +8403,8 @@
     <w:p>
       <w:pPr>
         <w:pStyle w:val="Default"/>
+        <w:keepNext w:val="1"/>
+        <w:keepLines w:val="1"/>
         <w:ind w:left="9360" w:firstLine="720"/>
         <w:rPr>
           <w:sz w:val="20"/>
@@ -8330,6 +8475,8 @@
     <w:p>
       <w:pPr>
         <w:pStyle w:val="Default"/>
+        <w:keepNext w:val="1"/>
+        <w:keepLines w:val="1"/>
         <w:rPr>
           <w:sz w:val="23"/>
           <w:szCs w:val="23"/>
@@ -8427,6 +8574,8 @@
     <w:p>
       <w:pPr>
         <w:pStyle w:val="Default"/>
+        <w:keepNext w:val="1"/>
+        <w:keepLines w:val="1"/>
         <w:rPr>
           <w:sz w:val="23"/>
           <w:szCs w:val="23"/>
@@ -8522,6 +8671,8 @@
     <w:p>
       <w:pPr>
         <w:pStyle w:val="Default"/>
+        <w:keepNext w:val="1"/>
+        <w:keepLines w:val="1"/>
         <w:rPr>
           <w:sz w:val="23"/>
           <w:szCs w:val="23"/>
@@ -8612,6 +8763,8 @@
     <w:p>
       <w:pPr>
         <w:pStyle w:val="Default"/>
+        <w:keepNext w:val="1"/>
+        <w:keepLines w:val="1"/>
         <w:jc w:val="center"/>
         <w:rPr>
           <w:b/>
@@ -8656,6 +8809,8 @@
     <w:p>
       <w:pPr>
         <w:pStyle w:val="Default"/>
+        <w:keepNext w:val="1"/>
+        <w:keepLines w:val="1"/>
         <w:ind w:left="10080"/>
         <w:rPr>
           <w:sz w:val="23"/>
@@ -8676,6 +8831,8 @@
     <w:p>
       <w:pPr>
         <w:pStyle w:val="Default"/>
+        <w:keepNext w:val="1"/>
+        <w:keepLines w:val="1"/>
         <w:ind w:left="10080"/>
         <w:rPr>
           <w:sz w:val="23"/>
@@ -8844,6 +9001,8 @@
     <w:p>
       <w:pPr>
         <w:pStyle w:val="Default"/>
+        <w:keepNext w:val="1"/>
+        <w:keepLines w:val="1"/>
         <w:ind w:left="11520" w:firstLine="720"/>
         <w:rPr>
           <w:sz w:val="23"/>
@@ -8861,11 +9020,15 @@
     <w:p>
       <w:pPr>
         <w:pStyle w:val="Default"/>
+        <w:keepNext w:val="1"/>
+        <w:keepLines w:val="1"/>
       </w:pPr>
     </w:p>
     <w:p>
       <w:pPr>
         <w:pStyle w:val="Default"/>
+        <w:keepNext w:val="1"/>
+        <w:keepLines w:val="1"/>
         <w:spacing w:after="240"/>
         <w:ind w:firstLine="720"/>
         <w:jc w:val="both"/>
@@ -8921,6 +9084,7 @@
       <w:tblPr>
         <w:tblStyle w:val="TableGrid"/>
         <w:tblW w:w="0" w:type="auto"/>
+        <w:jc w:val="center"/>
         <w:tblLayout w:type="fixed"/>
         <w:tblLook w:val="04A0" w:firstRow="1" w:lastRow="0" w:firstColumn="1" w:lastColumn="0" w:noHBand="0" w:noVBand="1"/>
       </w:tblPr>
@@ -10020,6 +10184,10 @@
     <w:p>
       <w:pPr>
         <w:pStyle w:val="Default"/>
+        <w:keepNext w:val="1"/>
+        <w:keepLines w:val="1"/>
+        <w:snapToGrid w:val="0"/>
+        <w:spacing w:before="0" w:after="0" w:line="240" w:lineRule="auto"/>
         <w:rPr>
           <w:b/>
           <w:bCs/>
@@ -10070,10 +10238,14 @@
     <w:p>
       <w:pPr>
         <w:pStyle w:val="Default"/>
+        <w:keepNext w:val="1"/>
+        <w:keepLines w:val="1"/>
         <w:numPr>
           <w:ilvl w:val="0"/>
           <w:numId w:val="2"/>
         </w:numPr>
+        <w:snapToGrid w:val="0"/>
+        <w:spacing w:before="0" w:after="0" w:line="240" w:lineRule="auto"/>
         <w:rPr>
           <w:b/>
           <w:bCs/>
@@ -10095,6 +10267,10 @@
     <w:p>
       <w:pPr>
         <w:pStyle w:val="Default"/>
+        <w:keepNext w:val="1"/>
+        <w:keepLines w:val="1"/>
+        <w:snapToGrid w:val="0"/>
+        <w:spacing w:before="0" w:after="0" w:line="40" w:lineRule="exact"/>
         <w:ind w:left="720" w:firstLine="720"/>
         <w:rPr>
           <w:b/>
@@ -10107,6 +10283,10 @@
     <w:p>
       <w:pPr>
         <w:pStyle w:val="Default"/>
+        <w:keepNext w:val="1"/>
+        <w:keepLines w:val="1"/>
+        <w:snapToGrid w:val="0"/>
+        <w:spacing w:before="0" w:after="0" w:line="40" w:lineRule="exact"/>
         <w:ind w:left="720" w:firstLine="720"/>
         <w:rPr>
           <w:b/>
@@ -10119,6 +10299,10 @@
     <w:p>
       <w:pPr>
         <w:pStyle w:val="Default"/>
+        <w:keepNext w:val="1"/>
+        <w:keepLines w:val="1"/>
+        <w:snapToGrid w:val="0"/>
+        <w:spacing w:before="0" w:after="0" w:line="240" w:lineRule="auto"/>
         <w:ind w:left="1440"/>
         <w:rPr>
           <w:sz w:val="22"/>
@@ -10145,6 +10329,10 @@
     <w:p>
       <w:pPr>
         <w:pStyle w:val="Default"/>
+        <w:keepNext w:val="1"/>
+        <w:keepLines w:val="1"/>
+        <w:snapToGrid w:val="0"/>
+        <w:spacing w:before="0" w:after="0" w:line="240" w:lineRule="auto"/>
         <w:rPr>
           <w:sz w:val="22"/>
           <w:szCs w:val="22"/>
@@ -10170,6 +10358,10 @@
     <w:p>
       <w:pPr>
         <w:pStyle w:val="Default"/>
+        <w:keepNext w:val="1"/>
+        <w:keepLines w:val="1"/>
+        <w:snapToGrid w:val="0"/>
+        <w:spacing w:before="0" w:after="0" w:line="240" w:lineRule="auto"/>
         <w:rPr>
           <w:b/>
           <w:sz w:val="22"/>
@@ -10258,6 +10450,10 @@
     <w:p>
       <w:pPr>
         <w:pStyle w:val="Default"/>
+        <w:keepNext w:val="1"/>
+        <w:keepLines w:val="1"/>
+        <w:snapToGrid w:val="0"/>
+        <w:spacing w:before="0" w:after="0" w:line="40" w:lineRule="exact"/>
         <w:rPr>
           <w:b/>
           <w:sz w:val="22"/>
@@ -10396,6 +10592,10 @@
     <w:p>
       <w:pPr>
         <w:pStyle w:val="Default"/>
+        <w:keepNext w:val="1"/>
+        <w:keepLines w:val="1"/>
+        <w:snapToGrid w:val="0"/>
+        <w:spacing w:before="0" w:after="0" w:line="240" w:lineRule="auto"/>
         <w:rPr>
           <w:sz w:val="20"/>
           <w:szCs w:val="20"/>
@@ -10702,6 +10902,10 @@
     <w:p>
       <w:pPr>
         <w:pStyle w:val="Default"/>
+        <w:keepNext w:val="1"/>
+        <w:keepLines w:val="1"/>
+        <w:snapToGrid w:val="0"/>
+        <w:spacing w:before="0" w:after="0" w:line="240" w:lineRule="auto"/>
         <w:rPr>
           <w:b/>
           <w:bCs/>
@@ -10887,6 +11091,10 @@
     <w:p>
       <w:pPr>
         <w:pStyle w:val="Default"/>
+        <w:keepNext w:val="1"/>
+        <w:keepLines w:val="1"/>
+        <w:snapToGrid w:val="0"/>
+        <w:spacing w:before="0" w:after="0" w:line="240" w:lineRule="auto"/>
         <w:rPr>
           <w:b/>
           <w:bCs/>
@@ -10988,6 +11196,10 @@
     <w:p>
       <w:pPr>
         <w:pStyle w:val="Default"/>
+        <w:keepNext w:val="0"/>
+        <w:keepLines w:val="1"/>
+        <w:snapToGrid w:val="0"/>
+        <w:spacing w:before="0" w:after="0" w:line="240" w:lineRule="auto"/>
         <w:ind w:left="9360" w:firstLine="720"/>
         <w:rPr>
           <w:sz w:val="20"/>
@@ -11049,6 +11261,8 @@
     <w:p>
       <w:pPr>
         <w:pStyle w:val="Default"/>
+        <w:keepNext w:val="1"/>
+        <w:keepLines w:val="1"/>
         <w:ind w:left="9360" w:firstLine="720"/>
         <w:rPr>
           <w:sz w:val="20"/>
@@ -11119,6 +11333,8 @@
     <w:p>
       <w:pPr>
         <w:pStyle w:val="Default"/>
+        <w:keepNext w:val="1"/>
+        <w:keepLines w:val="1"/>
         <w:rPr>
           <w:sz w:val="23"/>
           <w:szCs w:val="23"/>
@@ -11216,6 +11432,8 @@
     <w:p>
       <w:pPr>
         <w:pStyle w:val="Default"/>
+        <w:keepNext w:val="1"/>
+        <w:keepLines w:val="1"/>
         <w:rPr>
           <w:sz w:val="23"/>
           <w:szCs w:val="23"/>
@@ -11311,6 +11529,8 @@
     <w:p>
       <w:pPr>
         <w:pStyle w:val="Default"/>
+        <w:keepNext w:val="1"/>
+        <w:keepLines w:val="1"/>
         <w:rPr>
           <w:sz w:val="23"/>
           <w:szCs w:val="23"/>
@@ -11401,6 +11621,8 @@
     <w:p>
       <w:pPr>
         <w:pStyle w:val="Default"/>
+        <w:keepNext w:val="1"/>
+        <w:keepLines w:val="1"/>
         <w:jc w:val="center"/>
         <w:rPr>
           <w:b/>
@@ -11445,6 +11667,8 @@
     <w:p>
       <w:pPr>
         <w:pStyle w:val="Default"/>
+        <w:keepNext w:val="1"/>
+        <w:keepLines w:val="1"/>
         <w:ind w:left="10080"/>
         <w:rPr>
           <w:sz w:val="23"/>
@@ -11465,6 +11689,8 @@
     <w:p>
       <w:pPr>
         <w:pStyle w:val="Default"/>
+        <w:keepNext w:val="1"/>
+        <w:keepLines w:val="1"/>
         <w:ind w:left="10080"/>
         <w:rPr>
           <w:sz w:val="23"/>
@@ -11633,6 +11859,8 @@
     <w:p>
       <w:pPr>
         <w:pStyle w:val="Default"/>
+        <w:keepNext w:val="1"/>
+        <w:keepLines w:val="1"/>
         <w:ind w:left="11520" w:firstLine="720"/>
         <w:rPr>
           <w:sz w:val="23"/>
@@ -11650,11 +11878,15 @@
     <w:p>
       <w:pPr>
         <w:pStyle w:val="Default"/>
+        <w:keepNext w:val="1"/>
+        <w:keepLines w:val="1"/>
       </w:pPr>
     </w:p>
     <w:p>
       <w:pPr>
         <w:pStyle w:val="Default"/>
+        <w:keepNext w:val="1"/>
+        <w:keepLines w:val="1"/>
         <w:spacing w:after="240"/>
         <w:ind w:firstLine="720"/>
         <w:jc w:val="both"/>
@@ -11710,6 +11942,7 @@
       <w:tblPr>
         <w:tblStyle w:val="TableGrid"/>
         <w:tblW w:w="0" w:type="auto"/>
+        <w:jc w:val="center"/>
         <w:tblLayout w:type="fixed"/>
         <w:tblLook w:val="04A0" w:firstRow="1" w:lastRow="0" w:firstColumn="1" w:lastColumn="0" w:noHBand="0" w:noVBand="1"/>
       </w:tblPr>
@@ -13632,6 +13865,7 @@
       <w:tblPr>
         <w:tblStyle w:val="TableGrid"/>
         <w:tblW w:w="0" w:type="auto"/>
+        <w:jc w:val="center"/>
         <w:tblLayout w:type="fixed"/>
         <w:tblLook w:val="04A0" w:firstRow="1" w:lastRow="0" w:firstColumn="1" w:lastColumn="0" w:noHBand="0" w:noVBand="1"/>
       </w:tblPr>
@@ -15428,6 +15662,10 @@
     <w:p>
       <w:pPr>
         <w:pStyle w:val="Default"/>
+        <w:keepNext w:val="1"/>
+        <w:keepLines w:val="1"/>
+        <w:snapToGrid w:val="0"/>
+        <w:spacing w:before="0" w:after="0" w:line="240" w:lineRule="auto"/>
         <w:rPr>
           <w:b/>
           <w:bCs/>
@@ -15478,10 +15716,14 @@
     <w:p>
       <w:pPr>
         <w:pStyle w:val="Default"/>
+        <w:keepNext w:val="1"/>
+        <w:keepLines w:val="1"/>
         <w:numPr>
           <w:ilvl w:val="0"/>
           <w:numId w:val="2"/>
         </w:numPr>
+        <w:snapToGrid w:val="0"/>
+        <w:spacing w:before="0" w:after="0" w:line="240" w:lineRule="auto"/>
         <w:rPr>
           <w:b/>
           <w:bCs/>
@@ -15504,6 +15746,10 @@
     <w:p>
       <w:pPr>
         <w:pStyle w:val="Default"/>
+        <w:keepNext w:val="1"/>
+        <w:keepLines w:val="1"/>
+        <w:snapToGrid w:val="0"/>
+        <w:spacing w:before="0" w:after="0" w:line="40" w:lineRule="exact"/>
         <w:rPr>
           <w:b/>
           <w:bCs/>
@@ -15515,6 +15761,10 @@
     <w:p>
       <w:pPr>
         <w:pStyle w:val="Default"/>
+        <w:keepNext w:val="1"/>
+        <w:keepLines w:val="1"/>
+        <w:snapToGrid w:val="0"/>
+        <w:spacing w:before="0" w:after="0" w:line="40" w:lineRule="exact"/>
         <w:rPr>
           <w:b/>
           <w:bCs/>
@@ -15526,6 +15776,10 @@
     <w:p>
       <w:pPr>
         <w:pStyle w:val="Default"/>
+        <w:keepNext w:val="1"/>
+        <w:keepLines w:val="1"/>
+        <w:snapToGrid w:val="0"/>
+        <w:spacing w:before="0" w:after="0" w:line="240" w:lineRule="auto"/>
         <w:ind w:left="1440"/>
         <w:rPr>
           <w:sz w:val="22"/>
@@ -15552,6 +15806,10 @@
     <w:p>
       <w:pPr>
         <w:pStyle w:val="Default"/>
+        <w:keepNext w:val="1"/>
+        <w:keepLines w:val="1"/>
+        <w:snapToGrid w:val="0"/>
+        <w:spacing w:before="0" w:after="0" w:line="240" w:lineRule="auto"/>
         <w:rPr>
           <w:sz w:val="22"/>
           <w:szCs w:val="22"/>
@@ -15577,6 +15835,10 @@
     <w:p>
       <w:pPr>
         <w:pStyle w:val="Default"/>
+        <w:keepNext w:val="1"/>
+        <w:keepLines w:val="1"/>
+        <w:snapToGrid w:val="0"/>
+        <w:spacing w:before="0" w:after="0" w:line="240" w:lineRule="auto"/>
         <w:rPr>
           <w:b/>
           <w:sz w:val="22"/>
@@ -15693,6 +15955,10 @@
     <w:p>
       <w:pPr>
         <w:pStyle w:val="Default"/>
+        <w:keepNext w:val="1"/>
+        <w:keepLines w:val="1"/>
+        <w:snapToGrid w:val="0"/>
+        <w:spacing w:before="0" w:after="0" w:line="40" w:lineRule="exact"/>
         <w:rPr>
           <w:b/>
           <w:sz w:val="22"/>
@@ -15831,6 +16097,10 @@
     <w:p>
       <w:pPr>
         <w:pStyle w:val="Default"/>
+        <w:keepNext w:val="1"/>
+        <w:keepLines w:val="1"/>
+        <w:snapToGrid w:val="0"/>
+        <w:spacing w:before="0" w:after="0" w:line="240" w:lineRule="auto"/>
         <w:rPr>
           <w:sz w:val="20"/>
           <w:szCs w:val="20"/>
@@ -16137,6 +16407,10 @@
     <w:p>
       <w:pPr>
         <w:pStyle w:val="Default"/>
+        <w:keepNext w:val="1"/>
+        <w:keepLines w:val="1"/>
+        <w:snapToGrid w:val="0"/>
+        <w:spacing w:before="0" w:after="0" w:line="240" w:lineRule="auto"/>
         <w:rPr>
           <w:b/>
           <w:bCs/>
@@ -16322,6 +16596,10 @@
     <w:p>
       <w:pPr>
         <w:pStyle w:val="Default"/>
+        <w:keepNext w:val="1"/>
+        <w:keepLines w:val="1"/>
+        <w:snapToGrid w:val="0"/>
+        <w:spacing w:before="0" w:after="0" w:line="240" w:lineRule="auto"/>
         <w:rPr>
           <w:b/>
           <w:bCs/>
@@ -16423,6 +16701,10 @@
     <w:p>
       <w:pPr>
         <w:pStyle w:val="Default"/>
+        <w:keepNext w:val="0"/>
+        <w:keepLines w:val="1"/>
+        <w:snapToGrid w:val="0"/>
+        <w:spacing w:before="0" w:after="0" w:line="240" w:lineRule="auto"/>
         <w:ind w:left="9360" w:firstLine="720"/>
         <w:rPr>
           <w:sz w:val="20"/>

</xml_diff>